<commit_message>
[week05] 노트북 뷰어 재현 캡처(Windows · MuJoCo 3.15.0, Control 슬라이더 · 양팔 대칭 · base_vx) + 보고서 부록 E · log
Co-Authored-By: Claude Opus 5.5 <noreply@anthropic.com>
Claude-Session: https://claude.ai/code/session_0113GDvw5Yirb1CnfBJB91Tq
</commit_message>
<xml_diff>
--- a/members/park-jongjin/reports/학부생_주간활동보고서_5주차_박종진_22212289_20261022.docx
+++ b/members/park-jongjin/reports/학부생_주간활동보고서_5주차_박종진_22212289_20261022.docx
@@ -1993,7 +1993,7 @@
         <w:rPr>
           <w:sz w:val="18"/>
         </w:rPr>
-        <w:t>D. 좌우 미러 규칙표 (b1/models/v1/docs/mirror_rules.md) · collision 형상 (v1/img/v1_collision.png)</w:t>
+        <w:t>D. 좌우 미러 규칙표 (b1/models/v1/docs/mirror_rules.md)</w:t>
       </w:r>
     </w:p>
     <w:p>
@@ -2041,10 +2041,21 @@
       </w:r>
     </w:p>
     <w:p>
+      <w:pPr>
+        <w:spacing w:after="60" w:line="276" w:lineRule="auto"/>
+      </w:pPr>
+      <w:r>
+        <w:rPr>
+          <w:sz w:val="18"/>
+        </w:rPr>
+        <w:t>E. 노트북 재현 (b1/models/v1/img/repro/, 10/16) — Windows · 한글 경로에서 v1_mjio.py → MuJoCo 3.15.0 뷰어: 75.097 kg 로드 · 영점 정지 / Control 슬라이더 양팔 shoulder_pitch 3 rad → 대칭 동작 / base_vx 0.195 m/s → 베이스 전진</w:t>
+      </w:r>
+    </w:p>
+    <w:p>
       <w:r>
         <w:drawing>
           <wp:inline xmlns:a="http://schemas.openxmlformats.org/drawingml/2006/main" xmlns:pic="http://schemas.openxmlformats.org/drawingml/2006/picture">
-            <wp:extent cx="2520000" cy="2268000"/>
+            <wp:extent cx="6120000" cy="1200000"/>
             <wp:docPr id="6" name="Picture 6"/>
             <wp:cNvGraphicFramePr>
               <a:graphicFrameLocks noChangeAspect="1"/>
@@ -2065,7 +2076,7 @@
                   <pic:spPr>
                     <a:xfrm>
                       <a:off x="0" y="0"/>
-                      <a:ext cx="2520000" cy="2268000"/>
+                      <a:ext cx="6120000" cy="1200000"/>
                     </a:xfrm>
                     <a:prstGeom prst="rect"/>
                   </pic:spPr>

</xml_diff>

<commit_message>
[week05] 함태훈 결과 반영(13b01ad): actuator_params 근거본, gravcomp 옵션 패치(+jointactuatorfrc, 기본 off), 링크 관성 입력 = 관절점 원점 파일, 검증 ② A/B(roll 상한 4.33° -> 0°) · ③ 국소 최적화(roll 39.77), 체크리스트 v0.4.1 0-3절 확정, IK 인터페이스 초안
Co-Authored-By: Claude Opus 5.5 <noreply@anthropic.com>
Claude-Session: https://claude.ai/code/session_0113GDvw5Yirb1CnfBJB91Tq
</commit_message>
<xml_diff>
--- a/members/park-jongjin/reports/학부생_주간활동보고서_5주차_박종진_22212289_20261022.docx
+++ b/members/park-jongjin/reports/학부생_주간활동보고서_5주차_박종진_22212289_20261022.docx
@@ -1227,7 +1227,7 @@
                 <w:sz w:val="16"/>
                 <w:szCs w:val="18"/>
               </w:rPr>
-              <w:t xml:space="preserve">③ 검증 ③ 토크 — 15° 격자 최악 3 kg pitch 42.91 · roll 38.89 N·m, × 1.2 = </w:t>
+              <w:t xml:space="preserve">③ 검증 ③ 토크 — 15° 격자 최악 3 kg pitch 42.91 · roll 39.77 N·m(함태훈 독립 계산 일치), × 1.2 = </w:t>
             </w:r>
             <w:r>
               <w:rPr>
@@ -1242,7 +1242,7 @@
                 <w:sz w:val="16"/>
                 <w:szCs w:val="18"/>
               </w:rPr>
-              <w:t>: v0 37.30 대비 그리퍼 0.5 kg(+2.7) · 페이로드 점 0.10 m 이동(+2.9). 처짐 4.83°(이론 4.85°) → 중력보상 0.000°. (근거: validate_model.md)</w:t>
+              <w:t>: v0 37.30 대비 그리퍼 0.5 kg(+2.7) · 페이로드 점 0.10 m 이동(+2.9). 처짐 4.83° → 중력보상 0.000°(gravcomp 방식은 roll 상한까지 0°). (근거: validate_model.md)</w:t>
             </w:r>
           </w:p>
         </w:tc>
@@ -1449,7 +1449,7 @@
               <w:rPr>
                 <w:sz w:val="16"/>
               </w:rPr>
-              <w:t>A1 편차 · 정면, A2 RI85 사양 회신 대기 / 빌드 규약(0-3절) 함태훈 합의 예정</w:t>
+              <w:t>A1 편차 · 정면, A2 RI85 사양 회신 대기 (빌드 규약 0-3절은 함태훈 동의로 확정 10/17)</w:t>
             </w:r>
           </w:p>
         </w:tc>
@@ -1922,7 +1922,7 @@
         <w:rPr>
           <w:sz w:val="16"/>
         </w:rPr>
-        <w:t>검증 5종: ① 질량 75.097 kg(기준 +0.004 %) 통과 ② 정지 유지 영점 0.045° 통과(수평은 중력보상 필요) ③ 3 kg pitch 42.91 · roll 38.89 · yaw 11.84 · elbow 11.78 N·m — 정격 46 가정 시 pitch 여유 7.2 % ④ 3,770자세 충돌 0 통과 ⑤ 504자세 0 mm 통과 · Isaac 사본 동등(1e-15)</w:t>
+        <w:t>검증 5종: ① 질량 75.097 kg(기준 +0.004 %) 통과 ② 정지 유지 영점 0.045° 통과(수평 · roll 상한은 gravcomp 보상 필요) ③ 3 kg pitch 42.92 · roll 39.77 · yaw 11.85 · elbow 11.78 N·m — 정격 46 가정 시 pitch 여유 7.2 % ④ 3,770자세 충돌 0 통과 ⑤ 504자세 0 mm 통과 · Isaac 사본 동등(1e-15)</w:t>
       </w:r>
     </w:p>
     <w:p>

</xml_diff>

<commit_message>
[week05] 팀장 10/19 회신 반영: 그리퍼 box 가정 유지, PDR 토크 기준 46 -> 52 N·m(assumptions_b1.json pdr_torque, v0.3) -> 검증 ③ 통과(pitch 여유 21.2 %), A팀 회신 대기 · 가정값 유지, 보고서 · log 갱신
Co-Authored-By: Claude Opus 5.5 <noreply@anthropic.com>
Claude-Session: https://claude.ai/code/session_0113GDvw5Yirb1CnfBJB91Tq
</commit_message>
<xml_diff>
--- a/members/park-jongjin/reports/학부생_주간활동보고서_5주차_박종진_22212289_20261022.docx
+++ b/members/park-jongjin/reports/학부생_주간활동보고서_5주차_박종진_22212289_20261022.docx
@@ -1010,7 +1010,7 @@
                 <w:b/>
                 <w:sz w:val="16"/>
               </w:rPr>
-              <w:t>42.91 N·m → 정격 46 기준 여유 7.2 %</w:t>
+              <w:t>42.92 N·m → 기준 52 N·m(팀장 상향) 여유 21.2 %</w:t>
             </w:r>
             <w:r>
               <w:rPr>
@@ -1047,18 +1047,6 @@
                 <w:sz w:val="16"/>
               </w:rPr>
               <w:t>100 %</w:t>
-            </w:r>
-          </w:p>
-          <w:p>
-            <w:pPr>
-              <w:spacing w:line="214" w:lineRule="exact"/>
-              <w:jc w:val="center"/>
-            </w:pPr>
-            <w:r>
-              <w:rPr>
-                <w:sz w:val="16"/>
-              </w:rPr>
-              <w:t>(③ 정격 대기)</w:t>
             </w:r>
           </w:p>
         </w:tc>
@@ -1227,7 +1215,7 @@
                 <w:sz w:val="16"/>
                 <w:szCs w:val="18"/>
               </w:rPr>
-              <w:t xml:space="preserve">③ 검증 ③ 토크 — 15° 격자 최악 3 kg pitch 42.91 · roll 39.77 N·m(함태훈 독립 계산 일치), × 1.2 = </w:t>
+              <w:t xml:space="preserve">③ 검증 ③ 토크 — 15° 격자 + 최적화 최악 3 kg pitch 42.92 · roll 39.77 N·m(함태훈 독립 계산 일치), × 1.2 = 51.5: v0 37.30 대비 그리퍼 0.5 kg(+2.7) · 페이로드 점 0.10 m(+2.9) → 팀장 10/19 </w:t>
             </w:r>
             <w:r>
               <w:rPr>
@@ -1235,14 +1223,14 @@
                 <w:sz w:val="16"/>
                 <w:szCs w:val="18"/>
               </w:rPr>
-              <w:t>51.5 &gt; 46</w:t>
+              <w:t>기준 46 → 52 N·m 상향</w:t>
             </w:r>
             <w:r>
               <w:rPr>
                 <w:sz w:val="16"/>
                 <w:szCs w:val="18"/>
               </w:rPr>
-              <w:t>: v0 37.30 대비 그리퍼 0.5 kg(+2.7) · 페이로드 점 0.10 m 이동(+2.9). 처짐 4.83° → 중력보상 0.000°(gravcomp 방식은 roll 상한까지 0°). (근거: validate_model.md)</w:t>
+              <w:t>. 처짐 4.83° → 중력보상 0.000°(gravcomp 방식은 roll 상한까지 0°). (근거: validate_model.md)</w:t>
             </w:r>
           </w:p>
         </w:tc>
@@ -1391,7 +1379,7 @@
               <w:rPr>
                 <w:sz w:val="16"/>
               </w:rPr>
-              <w:t>검증 ③: 그리퍼 · TCP 가정 시 3 kg 토크 42.91 N·m(정격 46 기준 여유 7.2 %) → 그리퍼 BOM 요청</w:t>
+              <w:t>그리퍼 BOM 없음 → box 가정 유지, 토크 기준 52 N·m로 상향(팀장 10/19 회신, 반영 완료)</w:t>
             </w:r>
           </w:p>
         </w:tc>
@@ -1449,7 +1437,7 @@
               <w:rPr>
                 <w:sz w:val="16"/>
               </w:rPr>
-              <w:t>A1 편차 · 정면, A2 RI85 사양 회신 대기 (빌드 규약 0-3절은 함태훈 동의로 확정 10/17)</w:t>
+              <w:t>A1 편차 · 정면, A2 RI85 사양 — A팀 회신 대기(10/19), 가정값 유지</w:t>
             </w:r>
           </w:p>
         </w:tc>
@@ -1922,7 +1910,7 @@
         <w:rPr>
           <w:sz w:val="16"/>
         </w:rPr>
-        <w:t>검증 5종: ① 질량 75.097 kg(기준 +0.004 %) 통과 ② 정지 유지 영점 0.045° 통과(수평 · roll 상한은 gravcomp 보상 필요) ③ 3 kg pitch 42.92 · roll 39.77 · yaw 11.85 · elbow 11.78 N·m — 정격 46 가정 시 pitch 여유 7.2 % ④ 3,770자세 충돌 0 통과 ⑤ 504자세 0 mm 통과 · Isaac 사본 동등(1e-15)</w:t>
+        <w:t>검증 5종: ① 질량 75.097 kg(기준 +0.004 %) 통과 ② 정지 유지 영점 0.045° 통과(수평 · roll 상한은 gravcomp 보상 필요) ③ 3 kg pitch 42.92 · roll 39.77 · yaw 11.85 · elbow 11.78 N·m — 기준 정격 52 N·m(팀장 10/19) 여유 pitch 21.2 % · roll 30.8 % 통과 ④ 3,770자세 충돌 0 통과 ⑤ 504자세 0 mm 통과 · Isaac 사본 동등(1e-15)</w:t>
       </w:r>
     </w:p>
     <w:p>

</xml_diff>